<commit_message>
fix: style for header.three.docx
</commit_message>
<xml_diff>
--- a/src/assets/headers/layout_three.docx
+++ b/src/assets/headers/layout_three.docx
@@ -18,64 +18,144 @@
           <w:rFonts w:ascii="Times New Roman" w:hAnsi="Times New Roman" w:cs="Times New Roman"/>
           <w:b/>
           <w:bCs/>
-          <w:noProof/>
           <w:sz w:val="56"/>
           <w:szCs w:val="56"/>
+        </w:rPr>
+        <w:t>{{</w:t>
+      </w:r>
+      <w:proofErr w:type="spellStart"/>
+      <w:r>
+        <w:rPr>
+          <w:rFonts w:ascii="Times New Roman" w:hAnsi="Times New Roman" w:cs="Times New Roman"/>
+          <w:b/>
+          <w:bCs/>
+          <w:sz w:val="56"/>
+          <w:szCs w:val="56"/>
+        </w:rPr>
+        <w:t>school_name</w:t>
+      </w:r>
+      <w:proofErr w:type="spellEnd"/>
+      <w:r>
+        <w:rPr>
+          <w:rFonts w:ascii="Times New Roman" w:hAnsi="Times New Roman" w:cs="Times New Roman"/>
+          <w:b/>
+          <w:bCs/>
+          <w:sz w:val="56"/>
+          <w:szCs w:val="56"/>
+        </w:rPr>
+        <w:t>}}</w:t>
+      </w:r>
+    </w:p>
+    <w:p>
+      <w:pPr>
+        <w:jc w:val="center"/>
+        <w:rPr>
+          <w:rFonts w:ascii="Times New Roman" w:hAnsi="Times New Roman" w:cs="Times New Roman"/>
+          <w:sz w:val="32"/>
+          <w:szCs w:val="32"/>
+        </w:rPr>
+      </w:pPr>
+      <w:r>
+        <w:rPr>
+          <w:rFonts w:ascii="Times New Roman" w:hAnsi="Times New Roman" w:cs="Times New Roman"/>
+          <w:sz w:val="32"/>
+          <w:szCs w:val="32"/>
+        </w:rPr>
+        <w:t>{{</w:t>
+      </w:r>
+      <w:proofErr w:type="spellStart"/>
+      <w:r>
+        <w:rPr>
+          <w:rFonts w:ascii="Times New Roman" w:hAnsi="Times New Roman" w:cs="Times New Roman"/>
+          <w:sz w:val="32"/>
+          <w:szCs w:val="32"/>
+        </w:rPr>
+        <w:t>examination_type</w:t>
+      </w:r>
+      <w:proofErr w:type="spellEnd"/>
+      <w:r>
+        <w:rPr>
+          <w:rFonts w:ascii="Times New Roman" w:hAnsi="Times New Roman" w:cs="Times New Roman"/>
+          <w:sz w:val="32"/>
+          <w:szCs w:val="32"/>
+        </w:rPr>
+        <w:t>}}</w:t>
+      </w:r>
+    </w:p>
+    <w:p>
+      <w:pPr>
+        <w:ind w:firstLine="720"/>
+        <w:rPr>
+          <w:rFonts w:ascii="Times New Roman" w:hAnsi="Times New Roman" w:cs="Times New Roman"/>
+          <w:sz w:val="28"/>
+          <w:szCs w:val="28"/>
+        </w:rPr>
+      </w:pPr>
+      <w:r>
+        <w:rPr>
+          <w:noProof/>
         </w:rPr>
         <mc:AlternateContent>
           <mc:Choice Requires="wps">
             <w:drawing>
-              <wp:anchor distT="0" distB="0" distL="114300" distR="114300" simplePos="0" relativeHeight="251662336" behindDoc="0" locked="0" layoutInCell="1" allowOverlap="1" wp14:anchorId="07534FE9" wp14:editId="215B9B1B">
+              <wp:anchor distT="0" distB="0" distL="114300" distR="114300" simplePos="0" relativeHeight="251663360" behindDoc="0" locked="0" layoutInCell="1" allowOverlap="1" wp14:anchorId="3176C95E" wp14:editId="080EB6EC">
                 <wp:simplePos x="0" y="0"/>
-                <wp:positionH relativeFrom="column">
-                  <wp:posOffset>-72728</wp:posOffset>
+                <wp:positionH relativeFrom="margin">
+                  <wp:align>left</wp:align>
                 </wp:positionH>
                 <wp:positionV relativeFrom="paragraph">
-                  <wp:posOffset>-43041</wp:posOffset>
+                  <wp:posOffset>403581</wp:posOffset>
                 </wp:positionV>
-                <wp:extent cx="7189470" cy="2041319"/>
-                <wp:effectExtent l="19050" t="19050" r="30480" b="35560"/>
+                <wp:extent cx="6981825" cy="16510"/>
+                <wp:effectExtent l="0" t="0" r="0" b="0"/>
                 <wp:wrapNone/>
-                <wp:docPr id="78152462" name="Rectangle 3"/>
-                <wp:cNvGraphicFramePr/>
+                <wp:docPr id="1" name="Graphic 1"/>
+                <wp:cNvGraphicFramePr>
+                  <a:graphicFrameLocks xmlns:a="http://schemas.openxmlformats.org/drawingml/2006/main"/>
+                </wp:cNvGraphicFramePr>
                 <a:graphic xmlns:a="http://schemas.openxmlformats.org/drawingml/2006/main">
                   <a:graphicData uri="http://schemas.microsoft.com/office/word/2010/wordprocessingShape">
                     <wps:wsp>
-                      <wps:cNvSpPr/>
+                      <wps:cNvSpPr>
+                        <a:spLocks/>
+                      </wps:cNvSpPr>
                       <wps:spPr>
                         <a:xfrm>
                           <a:off x="0" y="0"/>
-                          <a:ext cx="7189470" cy="2041319"/>
+                          <a:ext cx="6981825" cy="16510"/>
                         </a:xfrm>
-                        <a:prstGeom prst="rect">
+                        <a:custGeom>
                           <a:avLst/>
-                        </a:prstGeom>
-                        <a:noFill/>
-                        <a:ln w="57150" cap="flat" cmpd="sng" algn="ctr">
-                          <a:solidFill>
-                            <a:schemeClr val="dk1"/>
-                          </a:solidFill>
-                          <a:prstDash val="solid"/>
-                          <a:round/>
-                          <a:headEnd type="none" w="med" len="med"/>
-                          <a:tailEnd type="none" w="med" len="med"/>
-                        </a:ln>
+                          <a:gdLst/>
+                          <a:ahLst/>
+                          <a:cxnLst/>
+                          <a:rect l="l" t="t" r="r" b="b"/>
+                          <a:pathLst>
+                            <a:path w="6982459" h="16510">
+                              <a:moveTo>
+                                <a:pt x="6981899" y="0"/>
+                              </a:moveTo>
+                              <a:lnTo>
+                                <a:pt x="6981899" y="16465"/>
+                              </a:lnTo>
+                              <a:lnTo>
+                                <a:pt x="0" y="16465"/>
+                              </a:lnTo>
+                              <a:lnTo>
+                                <a:pt x="0" y="0"/>
+                              </a:lnTo>
+                              <a:lnTo>
+                                <a:pt x="6981899" y="0"/>
+                              </a:lnTo>
+                              <a:close/>
+                            </a:path>
+                          </a:pathLst>
+                        </a:custGeom>
+                        <a:solidFill>
+                          <a:srgbClr val="231F20"/>
+                        </a:solidFill>
                       </wps:spPr>
-                      <wps:style>
-                        <a:lnRef idx="0">
-                          <a:scrgbClr r="0" g="0" b="0"/>
-                        </a:lnRef>
-                        <a:fillRef idx="0">
-                          <a:scrgbClr r="0" g="0" b="0"/>
-                        </a:fillRef>
-                        <a:effectRef idx="0">
-                          <a:scrgbClr r="0" g="0" b="0"/>
-                        </a:effectRef>
-                        <a:fontRef idx="minor">
-                          <a:schemeClr val="dk1"/>
-                        </a:fontRef>
-                      </wps:style>
-                      <wps:bodyPr rot="0" spcFirstLastPara="0" vertOverflow="overflow" horzOverflow="overflow" vert="horz" wrap="square" lIns="91440" tIns="45720" rIns="91440" bIns="45720" numCol="1" spcCol="0" rtlCol="0" fromWordArt="0" anchor="ctr" anchorCtr="0" forceAA="0" compatLnSpc="1">
+                      <wps:bodyPr vertOverflow="clip" horzOverflow="clip" wrap="square" lIns="0" tIns="0" rIns="0" bIns="0" rtlCol="0">
                         <a:prstTxWarp prst="textNoShape">
                           <a:avLst/>
                         </a:prstTxWarp>
@@ -84,20 +164,15 @@
                     </wps:wsp>
                   </a:graphicData>
                 </a:graphic>
-                <wp14:sizeRelH relativeFrom="margin">
-                  <wp14:pctWidth>0</wp14:pctWidth>
-                </wp14:sizeRelH>
-                <wp14:sizeRelV relativeFrom="margin">
-                  <wp14:pctHeight>0</wp14:pctHeight>
-                </wp14:sizeRelV>
               </wp:anchor>
             </w:drawing>
           </mc:Choice>
           <mc:Fallback>
             <w:pict>
-              <v:rect w14:anchorId="19CF2497" id="Rectangle 3" o:spid="_x0000_s1026" style="position:absolute;margin-left:-5.75pt;margin-top:-3.4pt;width:566.1pt;height:160.75pt;z-index:251662336;visibility:visible;mso-wrap-style:square;mso-width-percent:0;mso-height-percent:0;mso-wrap-distance-left:9pt;mso-wrap-distance-top:0;mso-wrap-distance-right:9pt;mso-wrap-distance-bottom:0;mso-position-horizontal:absolute;mso-position-horizontal-relative:text;mso-position-vertical:absolute;mso-position-vertical-relative:text;mso-width-percent:0;mso-height-percent:0;mso-width-relative:margin;mso-height-relative:margin;v-text-anchor:middle" o:gfxdata="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" filled="f" strokecolor="black [3200]" strokeweight="4.5pt">
-                <v:stroke joinstyle="round"/>
-              </v:rect>
+              <v:shape w14:anchorId="79EE5A33" id="Graphic 1" o:spid="_x0000_s1026" style="position:absolute;margin-left:0;margin-top:31.8pt;width:549.75pt;height:1.3pt;z-index:251663360;visibility:visible;mso-wrap-style:square;mso-wrap-distance-left:9pt;mso-wrap-distance-top:0;mso-wrap-distance-right:9pt;mso-wrap-distance-bottom:0;mso-position-horizontal:left;mso-position-horizontal-relative:margin;mso-position-vertical:absolute;mso-position-vertical-relative:text;v-text-anchor:top" coordsize="6982459,16510" o:gfxdata="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" path="m6981899,r,16465l,16465,,,6981899,xe" fillcolor="#231f20" stroked="f">
+                <v:path arrowok="t"/>
+                <w10:wrap anchorx="margin"/>
+              </v:shape>
             </w:pict>
           </mc:Fallback>
         </mc:AlternateContent>
@@ -105,84 +180,6 @@
       <w:r>
         <w:rPr>
           <w:rFonts w:ascii="Times New Roman" w:hAnsi="Times New Roman" w:cs="Times New Roman"/>
-          <w:b/>
-          <w:bCs/>
-          <w:sz w:val="56"/>
-          <w:szCs w:val="56"/>
-        </w:rPr>
-        <w:t>{{</w:t>
-      </w:r>
-      <w:proofErr w:type="spellStart"/>
-      <w:r>
-        <w:rPr>
-          <w:rFonts w:ascii="Times New Roman" w:hAnsi="Times New Roman" w:cs="Times New Roman"/>
-          <w:b/>
-          <w:bCs/>
-          <w:sz w:val="56"/>
-          <w:szCs w:val="56"/>
-        </w:rPr>
-        <w:t>school_name</w:t>
-      </w:r>
-      <w:proofErr w:type="spellEnd"/>
-      <w:r>
-        <w:rPr>
-          <w:rFonts w:ascii="Times New Roman" w:hAnsi="Times New Roman" w:cs="Times New Roman"/>
-          <w:b/>
-          <w:bCs/>
-          <w:sz w:val="56"/>
-          <w:szCs w:val="56"/>
-        </w:rPr>
-        <w:t>}}</w:t>
-      </w:r>
-    </w:p>
-    <w:p>
-      <w:pPr>
-        <w:jc w:val="center"/>
-        <w:rPr>
-          <w:rFonts w:ascii="Times New Roman" w:hAnsi="Times New Roman" w:cs="Times New Roman"/>
-          <w:sz w:val="32"/>
-          <w:szCs w:val="32"/>
-        </w:rPr>
-      </w:pPr>
-      <w:r>
-        <w:rPr>
-          <w:rFonts w:ascii="Times New Roman" w:hAnsi="Times New Roman" w:cs="Times New Roman"/>
-          <w:sz w:val="32"/>
-          <w:szCs w:val="32"/>
-        </w:rPr>
-        <w:t>{{</w:t>
-      </w:r>
-      <w:proofErr w:type="spellStart"/>
-      <w:r>
-        <w:rPr>
-          <w:rFonts w:ascii="Times New Roman" w:hAnsi="Times New Roman" w:cs="Times New Roman"/>
-          <w:sz w:val="32"/>
-          <w:szCs w:val="32"/>
-        </w:rPr>
-        <w:t>examination_type</w:t>
-      </w:r>
-      <w:proofErr w:type="spellEnd"/>
-      <w:r>
-        <w:rPr>
-          <w:rFonts w:ascii="Times New Roman" w:hAnsi="Times New Roman" w:cs="Times New Roman"/>
-          <w:sz w:val="32"/>
-          <w:szCs w:val="32"/>
-        </w:rPr>
-        <w:t>}}</w:t>
-      </w:r>
-    </w:p>
-    <w:p>
-      <w:pPr>
-        <w:ind w:firstLine="720"/>
-        <w:rPr>
-          <w:rFonts w:ascii="Times New Roman" w:hAnsi="Times New Roman" w:cs="Times New Roman"/>
-          <w:sz w:val="28"/>
-          <w:szCs w:val="28"/>
-        </w:rPr>
-      </w:pPr>
-      <w:r>
-        <w:rPr>
-          <w:rFonts w:ascii="Times New Roman" w:hAnsi="Times New Roman" w:cs="Times New Roman"/>
           <w:noProof/>
           <w:sz w:val="28"/>
           <w:szCs w:val="28"/>
@@ -190,13 +187,13 @@
         <mc:AlternateContent>
           <mc:Choice Requires="wps">
             <w:drawing>
-              <wp:anchor distT="45720" distB="45720" distL="114300" distR="114300" simplePos="0" relativeHeight="251661312" behindDoc="0" locked="0" layoutInCell="1" allowOverlap="1" wp14:anchorId="34AE576B" wp14:editId="5325F1D2">
+              <wp:anchor distT="45720" distB="45720" distL="114300" distR="114300" simplePos="0" relativeHeight="251661312" behindDoc="0" locked="0" layoutInCell="1" allowOverlap="1" wp14:anchorId="34AE576B" wp14:editId="6966F73E">
                 <wp:simplePos x="0" y="0"/>
                 <wp:positionH relativeFrom="margin">
                   <wp:align>center</wp:align>
                 </wp:positionH>
                 <wp:positionV relativeFrom="paragraph">
-                  <wp:posOffset>606145</wp:posOffset>
+                  <wp:posOffset>558220</wp:posOffset>
                 </wp:positionV>
                 <wp:extent cx="6563995" cy="390525"/>
                 <wp:effectExtent l="0" t="0" r="0" b="9525"/>
@@ -327,7 +324,7 @@
                 <v:stroke joinstyle="miter"/>
                 <v:path gradientshapeok="t" o:connecttype="rect"/>
               </v:shapetype>
-              <v:shape id="Text Box 2" o:spid="_x0000_s1026" type="#_x0000_t202" style="position:absolute;left:0;text-align:left;margin-left:0;margin-top:47.75pt;width:516.85pt;height:30.75pt;z-index:251661312;visibility:visible;mso-wrap-style:square;mso-width-percent:0;mso-height-percent:0;mso-wrap-distance-left:9pt;mso-wrap-distance-top:3.6pt;mso-wrap-distance-right:9pt;mso-wrap-distance-bottom:3.6pt;mso-position-horizontal:center;mso-position-horizontal-relative:margin;mso-position-vertical:absolute;mso-position-vertical-relative:text;mso-width-percent:0;mso-height-percent:0;mso-width-relative:margin;mso-height-relative:margin;v-text-anchor:top" o:gfxdata="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" filled="f" stroked="f">
+              <v:shape id="Text Box 2" o:spid="_x0000_s1026" type="#_x0000_t202" style="position:absolute;left:0;text-align:left;margin-left:0;margin-top:43.95pt;width:516.85pt;height:30.75pt;z-index:251661312;visibility:visible;mso-wrap-style:square;mso-width-percent:0;mso-height-percent:0;mso-wrap-distance-left:9pt;mso-wrap-distance-top:3.6pt;mso-wrap-distance-right:9pt;mso-wrap-distance-bottom:3.6pt;mso-position-horizontal:center;mso-position-horizontal-relative:margin;mso-position-vertical:absolute;mso-position-vertical-relative:text;mso-width-percent:0;mso-height-percent:0;mso-width-relative:margin;mso-height-relative:margin;v-text-anchor:top" o:gfxdata="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" filled="f" stroked="f">
                 <v:textbox>
                   <w:txbxContent>
                     <w:p>
@@ -509,15 +506,92 @@
           <w:szCs w:val="32"/>
         </w:rPr>
       </w:pPr>
-    </w:p>
-    <w:p>
-      <w:pPr>
-        <w:rPr>
-          <w:rFonts w:ascii="Times New Roman" w:hAnsi="Times New Roman" w:cs="Times New Roman"/>
-          <w:sz w:val="32"/>
-          <w:szCs w:val="32"/>
-        </w:rPr>
-      </w:pPr>
+      <w:r>
+        <w:rPr>
+          <w:noProof/>
+        </w:rPr>
+        <mc:AlternateContent>
+          <mc:Choice Requires="wps">
+            <w:drawing>
+              <wp:anchor distT="0" distB="0" distL="114300" distR="114300" simplePos="0" relativeHeight="251665408" behindDoc="0" locked="0" layoutInCell="1" allowOverlap="1" wp14:anchorId="3CF322AE" wp14:editId="47463D16">
+                <wp:simplePos x="0" y="0"/>
+                <wp:positionH relativeFrom="margin">
+                  <wp:align>left</wp:align>
+                </wp:positionH>
+                <wp:positionV relativeFrom="paragraph">
+                  <wp:posOffset>718134</wp:posOffset>
+                </wp:positionV>
+                <wp:extent cx="6981825" cy="16510"/>
+                <wp:effectExtent l="0" t="0" r="0" b="0"/>
+                <wp:wrapNone/>
+                <wp:docPr id="1557081837" name="Graphic 1"/>
+                <wp:cNvGraphicFramePr>
+                  <a:graphicFrameLocks xmlns:a="http://schemas.openxmlformats.org/drawingml/2006/main"/>
+                </wp:cNvGraphicFramePr>
+                <a:graphic xmlns:a="http://schemas.openxmlformats.org/drawingml/2006/main">
+                  <a:graphicData uri="http://schemas.microsoft.com/office/word/2010/wordprocessingShape">
+                    <wps:wsp>
+                      <wps:cNvSpPr>
+                        <a:spLocks/>
+                      </wps:cNvSpPr>
+                      <wps:spPr>
+                        <a:xfrm>
+                          <a:off x="0" y="0"/>
+                          <a:ext cx="6981825" cy="16510"/>
+                        </a:xfrm>
+                        <a:custGeom>
+                          <a:avLst/>
+                          <a:gdLst/>
+                          <a:ahLst/>
+                          <a:cxnLst/>
+                          <a:rect l="l" t="t" r="r" b="b"/>
+                          <a:pathLst>
+                            <a:path w="6982459" h="16510">
+                              <a:moveTo>
+                                <a:pt x="6981899" y="0"/>
+                              </a:moveTo>
+                              <a:lnTo>
+                                <a:pt x="6981899" y="16465"/>
+                              </a:lnTo>
+                              <a:lnTo>
+                                <a:pt x="0" y="16465"/>
+                              </a:lnTo>
+                              <a:lnTo>
+                                <a:pt x="0" y="0"/>
+                              </a:lnTo>
+                              <a:lnTo>
+                                <a:pt x="6981899" y="0"/>
+                              </a:lnTo>
+                              <a:close/>
+                            </a:path>
+                          </a:pathLst>
+                        </a:custGeom>
+                        <a:solidFill>
+                          <a:srgbClr val="231F20"/>
+                        </a:solidFill>
+                      </wps:spPr>
+                      <wps:bodyPr vertOverflow="clip" horzOverflow="clip" wrap="square" lIns="0" tIns="0" rIns="0" bIns="0" rtlCol="0">
+                        <a:prstTxWarp prst="textNoShape">
+                          <a:avLst/>
+                        </a:prstTxWarp>
+                        <a:noAutofit/>
+                      </wps:bodyPr>
+                    </wps:wsp>
+                  </a:graphicData>
+                </a:graphic>
+              </wp:anchor>
+            </w:drawing>
+          </mc:Choice>
+          <mc:Fallback>
+            <w:pict>
+              <v:shape w14:anchorId="6DFB2CC8" id="Graphic 1" o:spid="_x0000_s1026" style="position:absolute;margin-left:0;margin-top:56.55pt;width:549.75pt;height:1.3pt;z-index:251665408;visibility:visible;mso-wrap-style:square;mso-wrap-distance-left:9pt;mso-wrap-distance-top:0;mso-wrap-distance-right:9pt;mso-wrap-distance-bottom:0;mso-position-horizontal:left;mso-position-horizontal-relative:margin;mso-position-vertical:absolute;mso-position-vertical-relative:text;v-text-anchor:top" coordsize="6982459,16510" o:gfxdata="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" path="m6981899,r,16465l,16465,,,6981899,xe" fillcolor="#231f20" stroked="f">
+                <v:path arrowok="t"/>
+                <w10:wrap anchorx="margin"/>
+              </v:shape>
+            </w:pict>
+          </mc:Fallback>
+        </mc:AlternateContent>
+      </w:r>
     </w:p>
     <w:p>
       <w:pPr>

</xml_diff>